<commit_message>
fix(manifest): record October 2026 physical validation in the canonical manifest
Follow-up on 21472ce/3933be1: those commits updated the README table
by hand, but the canonical manifest (config/sources.json) — the single
source of truth for the physical validation status — still listed
SF4, SF5, SF7 and SF8 as NOT PHYSICALLY VALIDATED, so the next
documentation rebuild would have reverted the README change.

- manifest: SF4/SF5/SF7/SF8 physicalValidation -> PHYSICALLY VALIDATED
  (2026-10 validation round); SF6 remains 2026-09
- README generated table regenerated from the manifest (English, with
  validation dates)
- technical manual chapter 16 status line and chapter 24 known
  limitations updated accordingly; manuals and stick documentation
  rebuilt; CHANGELOG gained an [Unreleased] entry
- checksums rebuilt

Validated: Pester 33/33, PSScriptAnalyzer 0 errors, manifest
consistency (CI mode), internal link check.
</commit_message>
<xml_diff>
--- a/docs/generated/RSS_Technical_Build_and_Management_Manual.docx
+++ b/docs/generated/RSS_Technical_Build_and_Management_Manual.docx
@@ -485,11 +485,7 @@
               <w:pStyle w:val="Compact"/>
             </w:pPr>
             <w:r>
-              <w:rPr>
-                <w:b/>
-                <w:bCs/>
-              </w:rPr>
-              <w:t xml:space="preserve">NOT PHYSICALLY VALIDATED</w:t>
+              <w:t xml:space="preserve">physically validated (2026-10)</w:t>
             </w:r>
           </w:p>
         </w:tc>
@@ -546,11 +542,7 @@
               <w:pStyle w:val="Compact"/>
             </w:pPr>
             <w:r>
-              <w:rPr>
-                <w:b/>
-                <w:bCs/>
-              </w:rPr>
-              <w:t xml:space="preserve">NOT PHYSICALLY VALIDATED</w:t>
+              <w:t xml:space="preserve">physically validated (2026-10)</w:t>
             </w:r>
           </w:p>
         </w:tc>
@@ -664,11 +656,7 @@
               <w:pStyle w:val="Compact"/>
             </w:pPr>
             <w:r>
-              <w:rPr>
-                <w:b/>
-                <w:bCs/>
-              </w:rPr>
-              <w:t xml:space="preserve">NOT PHYSICALLY VALIDATED</w:t>
+              <w:t xml:space="preserve">physically validated (2026-10)</w:t>
             </w:r>
           </w:p>
         </w:tc>
@@ -725,11 +713,7 @@
               <w:pStyle w:val="Compact"/>
             </w:pPr>
             <w:r>
-              <w:rPr>
-                <w:b/>
-                <w:bCs/>
-              </w:rPr>
-              <w:t xml:space="preserve">NOT PHYSICALLY VALIDATED</w:t>
+              <w:t xml:space="preserve">physically validated (2026-10)</w:t>
             </w:r>
           </w:p>
         </w:tc>
@@ -5019,7 +5003,7 @@
         <w:pStyle w:val="BodyText"/>
       </w:pPr>
       <w:r>
-        <w:t xml:space="preserve">Current physical status: only</w:t>
+        <w:t xml:space="preserve">Current physical status: all five profiles are</w:t>
       </w:r>
       <w:r>
         <w:t xml:space="preserve"> </w:t>
@@ -5029,26 +5013,13 @@
           <w:b/>
           <w:bCs/>
         </w:rPr>
-        <w:t xml:space="preserve">SF6 is physically validated</w:t>
-      </w:r>
-      <w:r>
-        <w:t xml:space="preserve">; SF4, SF5, SF7 and SF8 are</w:t>
-      </w:r>
-      <w:r>
-        <w:t xml:space="preserve"> </w:t>
-      </w:r>
-      <w:r>
-        <w:rPr>
-          <w:b/>
-          <w:bCs/>
-        </w:rPr>
-        <w:t xml:space="preserve">NOT PHYSICALLY VALIDATED</w:t>
-      </w:r>
-      <w:r>
-        <w:t xml:space="preserve"> </w:t>
-      </w:r>
-      <w:r>
-        <w:t xml:space="preserve">(Appendix B). A model may only be deployed in production after a successful physical test of that model on that media round.</w:t>
+        <w:t xml:space="preserve">PHYSICALLY VALIDATED</w:t>
+      </w:r>
+      <w:r>
+        <w:t xml:space="preserve"> </w:t>
+      </w:r>
+      <w:r>
+        <w:t xml:space="preserve">— SF6 in the 2026-09 round, SF4, SF5, SF7 and SF8 in the 2026-10 round (Appendix B). A model may only be deployed in production after a successful physical test of that model on that media round.</w:t>
       </w:r>
     </w:p>
     <w:bookmarkEnd w:id="49"/>
@@ -6537,18 +6508,6 @@
       </w:pPr>
       <w:r>
         <w:t xml:space="preserve">SF4 covers only the AMD variant; SF8 only the Intel Business edition.</w:t>
-      </w:r>
-    </w:p>
-    <w:p>
-      <w:pPr>
-        <w:pStyle w:val="Compact"/>
-        <w:numPr>
-          <w:ilvl w:val="0"/>
-          <w:numId w:val="1013"/>
-        </w:numPr>
-      </w:pPr>
-      <w:r>
-        <w:t xml:space="preserve">Physical validation is missing for SF4, SF5, SF7 and SF8 on the current media round.</w:t>
       </w:r>
     </w:p>
     <w:p>
@@ -7074,7 +7033,7 @@
               <w:pStyle w:val="Compact"/>
             </w:pPr>
             <w:r>
-              <w:t xml:space="preserve">NOT PHYSICALLY VALIDATED</w:t>
+              <w:t xml:space="preserve">PHYSICALLY VALIDATED (2026-10)</w:t>
             </w:r>
           </w:p>
         </w:tc>
@@ -7131,7 +7090,7 @@
               <w:pStyle w:val="Compact"/>
             </w:pPr>
             <w:r>
-              <w:t xml:space="preserve">NOT PHYSICALLY VALIDATED</w:t>
+              <w:t xml:space="preserve">PHYSICALLY VALIDATED (2026-10)</w:t>
             </w:r>
           </w:p>
         </w:tc>
@@ -7245,7 +7204,7 @@
               <w:pStyle w:val="Compact"/>
             </w:pPr>
             <w:r>
-              <w:t xml:space="preserve">NOT PHYSICALLY VALIDATED</w:t>
+              <w:t xml:space="preserve">PHYSICALLY VALIDATED (2026-10)</w:t>
             </w:r>
           </w:p>
         </w:tc>
@@ -7302,7 +7261,7 @@
               <w:pStyle w:val="Compact"/>
             </w:pPr>
             <w:r>
-              <w:t xml:space="preserve">NOT PHYSICALLY VALIDATED</w:t>
+              <w:t xml:space="preserve">PHYSICALLY VALIDATED (2026-10)</w:t>
             </w:r>
           </w:p>
         </w:tc>

</xml_diff>